<commit_message>
Update project report with GitHub link and clarify bot features
</commit_message>
<xml_diff>
--- a/reports/report.docx
+++ b/reports/report.docx
@@ -231,23 +231,7 @@
           <w:sz w:val="28"/>
           <w:szCs w:val="28"/>
         </w:rPr>
-        <w:t>Тема: Разработка статического веб-сайта и Telegram-бота «</w:t>
-      </w:r>
-      <w:proofErr w:type="spellStart"/>
-      <w:r>
-        <w:rPr>
-          <w:sz w:val="28"/>
-          <w:szCs w:val="28"/>
-        </w:rPr>
-        <w:t>Настюшка</w:t>
-      </w:r>
-      <w:proofErr w:type="spellEnd"/>
-      <w:r>
-        <w:rPr>
-          <w:sz w:val="28"/>
-          <w:szCs w:val="28"/>
-        </w:rPr>
-        <w:t>»</w:t>
+        <w:t>Тема: Разработка статического веб-сайта и Telegram-бота «Настюшка»</w:t>
       </w:r>
     </w:p>
     <w:p>
@@ -347,21 +331,12 @@
           <w:szCs w:val="28"/>
         </w:rPr>
       </w:pPr>
-      <w:proofErr w:type="spellStart"/>
-      <w:r>
-        <w:rPr>
-          <w:sz w:val="28"/>
-          <w:szCs w:val="28"/>
-        </w:rPr>
-        <w:t>Сетямин</w:t>
-      </w:r>
-      <w:proofErr w:type="spellEnd"/>
-      <w:r>
-        <w:rPr>
-          <w:sz w:val="28"/>
-          <w:szCs w:val="28"/>
-        </w:rPr>
-        <w:t xml:space="preserve"> Н. С.</w:t>
+      <w:r>
+        <w:rPr>
+          <w:sz w:val="28"/>
+          <w:szCs w:val="28"/>
+        </w:rPr>
+        <w:t>Сетямин Н. С.</w:t>
       </w:r>
     </w:p>
     <w:p>
@@ -2365,23 +2340,7 @@
           <w:sz w:val="28"/>
           <w:szCs w:val="28"/>
         </w:rPr>
-        <w:t xml:space="preserve">Настоящий отчёт составлен по итогам прохождения проектной (учебной) практики студентами первого курса направления подготовки 09.03.01 «Информатика и вычислительная техника» профиля «Программирование электронных устройств и систем» Московского политехнического университета (группа 251-328): Мейстер Олегом Викторовичем и </w:t>
-      </w:r>
-      <w:proofErr w:type="spellStart"/>
-      <w:r>
-        <w:rPr>
-          <w:sz w:val="28"/>
-          <w:szCs w:val="28"/>
-        </w:rPr>
-        <w:t>Сетяминым</w:t>
-      </w:r>
-      <w:proofErr w:type="spellEnd"/>
-      <w:r>
-        <w:rPr>
-          <w:sz w:val="28"/>
-          <w:szCs w:val="28"/>
-        </w:rPr>
-        <w:t xml:space="preserve"> Николаем Сергеевичем.</w:t>
+        <w:t>Настоящий отчёт составлен по итогам прохождения проектной (учебной) практики студентами первого курса направления подготовки 09.03.01 «Информатика и вычислительная техника» профиля «Программирование электронных устройств и систем» Московского политехнического университета (группа 251-328): Мейстер Олегом Викторовичем и Сетяминым Николаем Сергеевичем.</w:t>
       </w:r>
     </w:p>
     <w:p>
@@ -2456,23 +2415,7 @@
           <w:sz w:val="28"/>
           <w:szCs w:val="28"/>
         </w:rPr>
-        <w:t xml:space="preserve">освоение базовых команд системы контроля версий Git и платформы </w:t>
-      </w:r>
-      <w:proofErr w:type="spellStart"/>
-      <w:r>
-        <w:rPr>
-          <w:sz w:val="28"/>
-          <w:szCs w:val="28"/>
-        </w:rPr>
-        <w:t>GitHub</w:t>
-      </w:r>
-      <w:proofErr w:type="spellEnd"/>
-      <w:r>
-        <w:rPr>
-          <w:sz w:val="28"/>
-          <w:szCs w:val="28"/>
-        </w:rPr>
-        <w:t>;</w:t>
+        <w:t>освоение базовых команд системы контроля версий Git и платформы GitHub;</w:t>
       </w:r>
     </w:p>
     <w:p>
@@ -2535,23 +2478,7 @@
           <w:sz w:val="28"/>
           <w:szCs w:val="28"/>
         </w:rPr>
-        <w:t>разработка Telegram-бота «</w:t>
-      </w:r>
-      <w:proofErr w:type="spellStart"/>
-      <w:r>
-        <w:rPr>
-          <w:sz w:val="28"/>
-          <w:szCs w:val="28"/>
-        </w:rPr>
-        <w:t>Настюшка</w:t>
-      </w:r>
-      <w:proofErr w:type="spellEnd"/>
-      <w:r>
-        <w:rPr>
-          <w:sz w:val="28"/>
-          <w:szCs w:val="28"/>
-        </w:rPr>
-        <w:t>» на базе локальной LLM Ollama (вариативная часть);</w:t>
+        <w:t>разработка Telegram-бота «Настюшка» на базе локальной LLM Ollama (вариативная часть);</w:t>
       </w:r>
     </w:p>
     <w:p>
@@ -2705,23 +2632,7 @@
           <w:sz w:val="28"/>
           <w:szCs w:val="28"/>
         </w:rPr>
-        <w:t xml:space="preserve">Для управления версиями выбран сервис </w:t>
-      </w:r>
-      <w:proofErr w:type="spellStart"/>
-      <w:r>
-        <w:rPr>
-          <w:sz w:val="28"/>
-          <w:szCs w:val="28"/>
-        </w:rPr>
-        <w:t>GitHub</w:t>
-      </w:r>
-      <w:proofErr w:type="spellEnd"/>
-      <w:r>
-        <w:rPr>
-          <w:sz w:val="28"/>
-          <w:szCs w:val="28"/>
-        </w:rPr>
-        <w:t xml:space="preserve">. Создан репозиторий MEISSSTER/PRACTICE на основе предоставленного шаблона с публичным доступом. Оба участника добавлены в качестве </w:t>
+        <w:t xml:space="preserve">Для управления версиями выбран сервис GitHub. Создан репозиторий MEISSSTER/PRACTICE на основе предоставленного шаблона с публичным доступом. Оба участника добавлены в качестве </w:t>
       </w:r>
       <w:r>
         <w:rPr>
@@ -3029,23 +2940,7 @@
           <w:sz w:val="28"/>
           <w:szCs w:val="28"/>
         </w:rPr>
-        <w:t xml:space="preserve">контент Hugo-сайта в папке </w:t>
-      </w:r>
-      <w:proofErr w:type="spellStart"/>
-      <w:r>
-        <w:rPr>
-          <w:sz w:val="28"/>
-          <w:szCs w:val="28"/>
-        </w:rPr>
-        <w:t>content</w:t>
-      </w:r>
-      <w:proofErr w:type="spellEnd"/>
-      <w:r>
-        <w:rPr>
-          <w:sz w:val="28"/>
-          <w:szCs w:val="28"/>
-        </w:rPr>
-        <w:t>/ (все разделы сайта);</w:t>
+        <w:t>контент Hugo-сайта в папке content/ (все разделы сайта);</w:t>
       </w:r>
     </w:p>
     <w:p>
@@ -3208,39 +3103,7 @@
           <w:sz w:val="28"/>
           <w:szCs w:val="28"/>
         </w:rPr>
-        <w:t>Создана первая версия сайта, размещённая в репозитории MEISSSTER/</w:t>
-      </w:r>
-      <w:proofErr w:type="spellStart"/>
-      <w:r>
-        <w:rPr>
-          <w:sz w:val="28"/>
-          <w:szCs w:val="28"/>
-        </w:rPr>
-        <w:t>MiniSite</w:t>
-      </w:r>
-      <w:proofErr w:type="spellEnd"/>
-      <w:r>
-        <w:rPr>
-          <w:sz w:val="28"/>
-          <w:szCs w:val="28"/>
-        </w:rPr>
-        <w:t xml:space="preserve">. В процессе освоены семантические элементы HTML5, CSS-позиционирование, </w:t>
-      </w:r>
-      <w:proofErr w:type="spellStart"/>
-      <w:r>
-        <w:rPr>
-          <w:sz w:val="28"/>
-          <w:szCs w:val="28"/>
-        </w:rPr>
-        <w:t>медиазапросы</w:t>
-      </w:r>
-      <w:proofErr w:type="spellEnd"/>
-      <w:r>
-        <w:rPr>
-          <w:sz w:val="28"/>
-          <w:szCs w:val="28"/>
-        </w:rPr>
-        <w:t xml:space="preserve"> и инструменты разработчика.</w:t>
+        <w:t>Создана первая версия сайта, размещённая в репозитории MEISSSTER/MiniSite. В процессе освоены семантические элементы HTML5, CSS-позиционирование, медиазапросы и инструменты разработчика.</w:t>
       </w:r>
     </w:p>
     <w:p>
@@ -3564,39 +3427,7 @@
           <w:sz w:val="28"/>
           <w:szCs w:val="28"/>
         </w:rPr>
-        <w:t xml:space="preserve">Отчёт составлен на основании шаблона из папки </w:t>
-      </w:r>
-      <w:proofErr w:type="spellStart"/>
-      <w:r>
-        <w:rPr>
-          <w:sz w:val="28"/>
-          <w:szCs w:val="28"/>
-        </w:rPr>
-        <w:t>reports</w:t>
-      </w:r>
-      <w:proofErr w:type="spellEnd"/>
-      <w:r>
-        <w:rPr>
-          <w:sz w:val="28"/>
-          <w:szCs w:val="28"/>
-        </w:rPr>
-        <w:t xml:space="preserve"> и оформлен в соответствии с ГОСТ 7.32-2017. Файлы report.docx и report.pdf размещены в папке </w:t>
-      </w:r>
-      <w:proofErr w:type="spellStart"/>
-      <w:r>
-        <w:rPr>
-          <w:sz w:val="28"/>
-          <w:szCs w:val="28"/>
-        </w:rPr>
-        <w:t>reports</w:t>
-      </w:r>
-      <w:proofErr w:type="spellEnd"/>
-      <w:r>
-        <w:rPr>
-          <w:sz w:val="28"/>
-          <w:szCs w:val="28"/>
-        </w:rPr>
-        <w:t xml:space="preserve"> репозитория и загружены в СДО.</w:t>
+        <w:t>Отчёт составлен на основании шаблона из папки reports и оформлен в соответствии с ГОСТ 7.32-2017. Файлы report.docx и report.pdf размещены в папке reports репозитория и загружены в СДО.</w:t>
       </w:r>
     </w:p>
     <w:p>
@@ -3681,23 +3512,43 @@
           <w:sz w:val="28"/>
           <w:szCs w:val="28"/>
         </w:rPr>
-        <w:t>В качестве вариативного задания выбран вариант 2 — «Практическая реализация технологии». Тема согласована внутри команды: разработка Telegram-бота «</w:t>
-      </w:r>
-      <w:proofErr w:type="spellStart"/>
-      <w:r>
-        <w:rPr>
-          <w:sz w:val="28"/>
-          <w:szCs w:val="28"/>
-        </w:rPr>
-        <w:t>Настюшка</w:t>
-      </w:r>
-      <w:proofErr w:type="spellEnd"/>
-      <w:r>
-        <w:rPr>
-          <w:sz w:val="28"/>
-          <w:szCs w:val="28"/>
-        </w:rPr>
-        <w:t>» на базе локальной языковой модели Ollama.</w:t>
+        <w:t>В качестве вариативного задания выбран вариант 2 — «Практическая реализация технологии». Тема согласована внутри команды: разработка Telegram-бота «Настюшка» на базе локальной языковой модели Ollama</w:t>
+      </w:r>
+      <w:r>
+        <w:rPr>
+          <w:sz w:val="28"/>
+          <w:szCs w:val="28"/>
+        </w:rPr>
+        <w:t xml:space="preserve">, </w:t>
+      </w:r>
+      <w:r>
+        <w:rPr>
+          <w:sz w:val="28"/>
+          <w:szCs w:val="28"/>
+          <w:lang w:val="en-US"/>
+        </w:rPr>
+        <w:t>GitHub</w:t>
+      </w:r>
+      <w:r>
+        <w:rPr>
+          <w:sz w:val="28"/>
+          <w:szCs w:val="28"/>
+        </w:rPr>
+        <w:t xml:space="preserve"> проекта </w:t>
+      </w:r>
+      <w:r>
+        <w:rPr>
+          <w:sz w:val="28"/>
+          <w:szCs w:val="28"/>
+        </w:rPr>
+        <w:t>https://github.com/Nikolay-Vergis/Nastyshka</w:t>
+      </w:r>
+      <w:r>
+        <w:rPr>
+          <w:sz w:val="28"/>
+          <w:szCs w:val="28"/>
+        </w:rPr>
+        <w:t>.</w:t>
       </w:r>
     </w:p>
     <w:p>
@@ -3724,23 +3575,7 @@
           <w:sz w:val="28"/>
           <w:szCs w:val="28"/>
         </w:rPr>
-        <w:t>Концепция бота: «</w:t>
-      </w:r>
-      <w:proofErr w:type="spellStart"/>
-      <w:r>
-        <w:rPr>
-          <w:sz w:val="28"/>
-          <w:szCs w:val="28"/>
-        </w:rPr>
-        <w:t>Настюшка</w:t>
-      </w:r>
-      <w:proofErr w:type="spellEnd"/>
-      <w:r>
-        <w:rPr>
-          <w:sz w:val="28"/>
-          <w:szCs w:val="28"/>
-        </w:rPr>
-        <w:t>» позиционируется как бот психологической поддержки, однако реализует её нарочито абсурдным образом — использует актуальный молодёжный сленг и новомодные слова, при этом демонстративно притворяясь наивным и недалёким. Проект носит юмористический характер и служит практическим исследованием возможностей локальных LLM для генерации ролевых персонажей.</w:t>
+        <w:t>Концепция бота: «Настюшка» позиционируется как бот психологической поддержки, однако реализует её нарочито абсурдным образом — использует актуальный молодёжный сленг и новомодные слова, при этом демонстративно притворяясь наивным и недалёким. Проект носит юмористический характер и служит практическим исследованием возможностей локальных LLM для генерации ролевых персонажей.</w:t>
       </w:r>
     </w:p>
     <w:p>
@@ -3809,23 +3644,7 @@
           <w:sz w:val="28"/>
           <w:szCs w:val="28"/>
         </w:rPr>
-        <w:t xml:space="preserve">освоить разработку Telegram-ботов на Python (библиотека </w:t>
-      </w:r>
-      <w:proofErr w:type="spellStart"/>
-      <w:r>
-        <w:rPr>
-          <w:sz w:val="28"/>
-          <w:szCs w:val="28"/>
-        </w:rPr>
-        <w:t>python-telegram-bot</w:t>
-      </w:r>
-      <w:proofErr w:type="spellEnd"/>
-      <w:r>
-        <w:rPr>
-          <w:sz w:val="28"/>
-          <w:szCs w:val="28"/>
-        </w:rPr>
-        <w:t>);</w:t>
+        <w:t>освоить разработку Telegram-ботов на Python (библиотека python-telegram-bot);</w:t>
       </w:r>
     </w:p>
     <w:p>
@@ -3846,23 +3665,7 @@
           <w:sz w:val="28"/>
           <w:szCs w:val="28"/>
         </w:rPr>
-        <w:t xml:space="preserve">реализовать систему </w:t>
-      </w:r>
-      <w:proofErr w:type="spellStart"/>
-      <w:r>
-        <w:rPr>
-          <w:sz w:val="28"/>
-          <w:szCs w:val="28"/>
-        </w:rPr>
-        <w:t>промпт</w:t>
-      </w:r>
-      <w:proofErr w:type="spellEnd"/>
-      <w:r>
-        <w:rPr>
-          <w:sz w:val="28"/>
-          <w:szCs w:val="28"/>
-        </w:rPr>
-        <w:t>-инжиниринга для задания характера персонажа;</w:t>
+        <w:t>реализовать систему промпт-инжиниринга для задания характера персонажа;</w:t>
       </w:r>
     </w:p>
     <w:p>
@@ -3967,119 +3770,7 @@
           <w:sz w:val="28"/>
           <w:szCs w:val="28"/>
         </w:rPr>
-        <w:t xml:space="preserve">Ollama — инструмент для запуска больших языковых моделей (LLM) локально, без подключения к внешним API. Изучены: установка и запуск Ollama, загрузка моделей командой </w:t>
-      </w:r>
-      <w:proofErr w:type="spellStart"/>
-      <w:r>
-        <w:rPr>
-          <w:sz w:val="28"/>
-          <w:szCs w:val="28"/>
-        </w:rPr>
-        <w:t>ollama</w:t>
-      </w:r>
-      <w:proofErr w:type="spellEnd"/>
-      <w:r>
-        <w:rPr>
-          <w:sz w:val="28"/>
-          <w:szCs w:val="28"/>
-        </w:rPr>
-        <w:t xml:space="preserve"> pull, HTTP API для отправки запросов (</w:t>
-      </w:r>
-      <w:proofErr w:type="spellStart"/>
-      <w:r>
-        <w:rPr>
-          <w:sz w:val="28"/>
-          <w:szCs w:val="28"/>
-        </w:rPr>
-        <w:t>endpoint</w:t>
-      </w:r>
-      <w:proofErr w:type="spellEnd"/>
-      <w:r>
-        <w:rPr>
-          <w:sz w:val="28"/>
-          <w:szCs w:val="28"/>
-        </w:rPr>
-        <w:t xml:space="preserve"> /</w:t>
-      </w:r>
-      <w:proofErr w:type="spellStart"/>
-      <w:r>
-        <w:rPr>
-          <w:sz w:val="28"/>
-          <w:szCs w:val="28"/>
-        </w:rPr>
-        <w:t>api</w:t>
-      </w:r>
-      <w:proofErr w:type="spellEnd"/>
-      <w:r>
-        <w:rPr>
-          <w:sz w:val="28"/>
-          <w:szCs w:val="28"/>
-        </w:rPr>
-        <w:t>/</w:t>
-      </w:r>
-      <w:proofErr w:type="spellStart"/>
-      <w:r>
-        <w:rPr>
-          <w:sz w:val="28"/>
-          <w:szCs w:val="28"/>
-        </w:rPr>
-        <w:t>chat</w:t>
-      </w:r>
-      <w:proofErr w:type="spellEnd"/>
-      <w:r>
-        <w:rPr>
-          <w:sz w:val="28"/>
-          <w:szCs w:val="28"/>
-        </w:rPr>
-        <w:t>), параметры генерации (</w:t>
-      </w:r>
-      <w:proofErr w:type="spellStart"/>
-      <w:r>
-        <w:rPr>
-          <w:sz w:val="28"/>
-          <w:szCs w:val="28"/>
-        </w:rPr>
-        <w:t>temperature</w:t>
-      </w:r>
-      <w:proofErr w:type="spellEnd"/>
-      <w:r>
-        <w:rPr>
-          <w:sz w:val="28"/>
-          <w:szCs w:val="28"/>
-        </w:rPr>
-        <w:t xml:space="preserve">, </w:t>
-      </w:r>
-      <w:proofErr w:type="spellStart"/>
-      <w:r>
-        <w:rPr>
-          <w:sz w:val="28"/>
-          <w:szCs w:val="28"/>
-        </w:rPr>
-        <w:t>top_p</w:t>
-      </w:r>
-      <w:proofErr w:type="spellEnd"/>
-      <w:r>
-        <w:rPr>
-          <w:sz w:val="28"/>
-          <w:szCs w:val="28"/>
-        </w:rPr>
-        <w:t xml:space="preserve">, </w:t>
-      </w:r>
-      <w:proofErr w:type="spellStart"/>
-      <w:r>
-        <w:rPr>
-          <w:sz w:val="28"/>
-          <w:szCs w:val="28"/>
-        </w:rPr>
-        <w:t>num_predict</w:t>
-      </w:r>
-      <w:proofErr w:type="spellEnd"/>
-      <w:r>
-        <w:rPr>
-          <w:sz w:val="28"/>
-          <w:szCs w:val="28"/>
-        </w:rPr>
-        <w:t>).</w:t>
+        <w:t>Ollama — инструмент для запуска больших языковых моделей (LLM) локально, без подключения к внешним API. Изучены: установка и запуск Ollama, загрузка моделей командой ollama pull, HTTP API для отправки запросов (endpoint /api/chat), параметры генерации (temperature, top_p, num_predict).</w:t>
       </w:r>
     </w:p>
     <w:p>
@@ -4106,7 +3797,6 @@
           <w:sz w:val="28"/>
           <w:szCs w:val="28"/>
         </w:rPr>
-        <w:lastRenderedPageBreak/>
         <w:t>Для проекта выбрана модель с оптимальным соотношением качества и скорости генерации на доступном оборудовании.</w:t>
       </w:r>
     </w:p>
@@ -4186,39 +3876,7 @@
           <w:sz w:val="28"/>
           <w:szCs w:val="28"/>
         </w:rPr>
-        <w:t xml:space="preserve">Для разработки использована библиотека </w:t>
-      </w:r>
-      <w:proofErr w:type="spellStart"/>
-      <w:r>
-        <w:rPr>
-          <w:sz w:val="28"/>
-          <w:szCs w:val="28"/>
-        </w:rPr>
-        <w:t>python-telegram-bot</w:t>
-      </w:r>
-      <w:proofErr w:type="spellEnd"/>
-      <w:r>
-        <w:rPr>
-          <w:sz w:val="28"/>
-          <w:szCs w:val="28"/>
-        </w:rPr>
-        <w:t>. Освоены: регистрация бота через @BotFather, обработка входящих сообщений (</w:t>
-      </w:r>
-      <w:proofErr w:type="spellStart"/>
-      <w:r>
-        <w:rPr>
-          <w:sz w:val="28"/>
-          <w:szCs w:val="28"/>
-        </w:rPr>
-        <w:t>MessageHandler</w:t>
-      </w:r>
-      <w:proofErr w:type="spellEnd"/>
-      <w:r>
-        <w:rPr>
-          <w:sz w:val="28"/>
-          <w:szCs w:val="28"/>
-        </w:rPr>
-        <w:t>), асинхронная отправка ответов, управление состоянием диалога.</w:t>
+        <w:t>Для разработки использована библиотека python-telegram-bot. Освоены: регистрация бота через @BotFather, обработка входящих сообщений (MessageHandler), асинхронная отправка ответов, управление состоянием диалога.</w:t>
       </w:r>
     </w:p>
     <w:p>
@@ -4237,18 +3895,8 @@
           <w:sz w:val="28"/>
           <w:szCs w:val="28"/>
         </w:rPr>
-        <w:t xml:space="preserve">2.2.3 </w:t>
-      </w:r>
-      <w:proofErr w:type="spellStart"/>
-      <w:r>
-        <w:rPr>
-          <w:color w:val="auto"/>
-          <w:sz w:val="28"/>
-          <w:szCs w:val="28"/>
-        </w:rPr>
-        <w:t>Промпт</w:t>
-      </w:r>
-      <w:proofErr w:type="spellEnd"/>
+        <w:t>2.2.3 Промпт</w:t>
+      </w:r>
       <w:r>
         <w:rPr>
           <w:color w:val="auto"/>
@@ -4341,39 +3989,7 @@
           <w:sz w:val="28"/>
           <w:szCs w:val="28"/>
         </w:rPr>
-        <w:t xml:space="preserve">Telegram </w:t>
-      </w:r>
-      <w:proofErr w:type="spellStart"/>
-      <w:r>
-        <w:rPr>
-          <w:sz w:val="28"/>
-          <w:szCs w:val="28"/>
-        </w:rPr>
-        <w:t>Bot</w:t>
-      </w:r>
-      <w:proofErr w:type="spellEnd"/>
-      <w:r>
-        <w:rPr>
-          <w:sz w:val="28"/>
-          <w:szCs w:val="28"/>
-        </w:rPr>
-        <w:t xml:space="preserve"> API ↔ </w:t>
-      </w:r>
-      <w:proofErr w:type="spellStart"/>
-      <w:r>
-        <w:rPr>
-          <w:sz w:val="28"/>
-          <w:szCs w:val="28"/>
-        </w:rPr>
-        <w:t>python-telegram-bot</w:t>
-      </w:r>
-      <w:proofErr w:type="spellEnd"/>
-      <w:r>
-        <w:rPr>
-          <w:sz w:val="28"/>
-          <w:szCs w:val="28"/>
-        </w:rPr>
-        <w:t xml:space="preserve"> — приём и отправка сообщений;</w:t>
+        <w:t>Telegram Bot API ↔ python-telegram-bot — приём и отправка сообщений;</w:t>
       </w:r>
     </w:p>
     <w:p>
@@ -4394,23 +4010,7 @@
           <w:sz w:val="28"/>
           <w:szCs w:val="28"/>
         </w:rPr>
-        <w:t xml:space="preserve">Модуль обработчика — формирование запроса к Ollama с системным </w:t>
-      </w:r>
-      <w:proofErr w:type="spellStart"/>
-      <w:r>
-        <w:rPr>
-          <w:sz w:val="28"/>
-          <w:szCs w:val="28"/>
-        </w:rPr>
-        <w:t>промптом</w:t>
-      </w:r>
-      <w:proofErr w:type="spellEnd"/>
-      <w:r>
-        <w:rPr>
-          <w:sz w:val="28"/>
-          <w:szCs w:val="28"/>
-        </w:rPr>
-        <w:t>;</w:t>
+        <w:t>Модуль обработчика — формирование запроса к Ollama с системным промптом;</w:t>
       </w:r>
     </w:p>
     <w:p>
@@ -4479,71 +4079,7 @@
           <w:sz w:val="28"/>
           <w:szCs w:val="28"/>
         </w:rPr>
-        <w:t xml:space="preserve">Системный </w:t>
-      </w:r>
-      <w:proofErr w:type="spellStart"/>
-      <w:r>
-        <w:rPr>
-          <w:sz w:val="28"/>
-          <w:szCs w:val="28"/>
-        </w:rPr>
-        <w:t>промпт</w:t>
-      </w:r>
-      <w:proofErr w:type="spellEnd"/>
-      <w:r>
-        <w:rPr>
-          <w:sz w:val="28"/>
-          <w:szCs w:val="28"/>
-        </w:rPr>
-        <w:t xml:space="preserve"> определяет характер «Настюшки»: она всегда отвечает с поддержкой и сочувствием, но вставляет неуместный актуальный сленг («</w:t>
-      </w:r>
-      <w:proofErr w:type="spellStart"/>
-      <w:r>
-        <w:rPr>
-          <w:sz w:val="28"/>
-          <w:szCs w:val="28"/>
-        </w:rPr>
-        <w:t>кринж</w:t>
-      </w:r>
-      <w:proofErr w:type="spellEnd"/>
-      <w:r>
-        <w:rPr>
-          <w:sz w:val="28"/>
-          <w:szCs w:val="28"/>
-        </w:rPr>
-        <w:t>», «</w:t>
-      </w:r>
-      <w:proofErr w:type="spellStart"/>
-      <w:r>
-        <w:rPr>
-          <w:sz w:val="28"/>
-          <w:szCs w:val="28"/>
-        </w:rPr>
-        <w:t>вайб</w:t>
-      </w:r>
-      <w:proofErr w:type="spellEnd"/>
-      <w:r>
-        <w:rPr>
-          <w:sz w:val="28"/>
-          <w:szCs w:val="28"/>
-        </w:rPr>
-        <w:t>», «го», «чилить», «</w:t>
-      </w:r>
-      <w:proofErr w:type="spellStart"/>
-      <w:r>
-        <w:rPr>
-          <w:sz w:val="28"/>
-          <w:szCs w:val="28"/>
-        </w:rPr>
-        <w:t>токсик</w:t>
-      </w:r>
-      <w:proofErr w:type="spellEnd"/>
-      <w:r>
-        <w:rPr>
-          <w:sz w:val="28"/>
-          <w:szCs w:val="28"/>
-        </w:rPr>
-        <w:t>» и др.) и регулярно демонстрирует непонимание серьёзности ситуации, переводя разговор на абсурдные темы.</w:t>
+        <w:t>Системный промпт определяет характер «Настюшки»: она всегда отвечает с поддержкой и сочувствием, но вставляет неуместный актуальный сленг («кринж», «вайб», «го», «чилить», «токсик» и др.) и регулярно демонстрирует непонимание серьёзности ситуации, переводя разговор на абсурдные темы.</w:t>
       </w:r>
     </w:p>
     <w:p>
@@ -4617,23 +4153,7 @@
           <w:sz w:val="28"/>
           <w:szCs w:val="28"/>
         </w:rPr>
-        <w:t xml:space="preserve">Ключевые поведенческие черты «Настюшки», заданные системным </w:t>
-      </w:r>
-      <w:proofErr w:type="spellStart"/>
-      <w:r>
-        <w:rPr>
-          <w:sz w:val="28"/>
-          <w:szCs w:val="28"/>
-        </w:rPr>
-        <w:t>промптом</w:t>
-      </w:r>
-      <w:proofErr w:type="spellEnd"/>
-      <w:r>
-        <w:rPr>
-          <w:sz w:val="28"/>
-          <w:szCs w:val="28"/>
-        </w:rPr>
-        <w:t>:</w:t>
+        <w:t>Ключевые поведенческие черты «Настюшки», заданные системным промптом:</w:t>
       </w:r>
     </w:p>
     <w:p>
@@ -4654,55 +4174,7 @@
           <w:sz w:val="28"/>
           <w:szCs w:val="28"/>
         </w:rPr>
-        <w:t xml:space="preserve">Всегда выражает поддержку, но формулирует её максимально неуместно и по-молодёжному («это полный </w:t>
-      </w:r>
-      <w:proofErr w:type="spellStart"/>
-      <w:r>
-        <w:rPr>
-          <w:sz w:val="28"/>
-          <w:szCs w:val="28"/>
-        </w:rPr>
-        <w:t>кринж</w:t>
-      </w:r>
-      <w:proofErr w:type="spellEnd"/>
-      <w:r>
-        <w:rPr>
-          <w:sz w:val="28"/>
-          <w:szCs w:val="28"/>
-        </w:rPr>
-        <w:t xml:space="preserve">, но ты справишься, </w:t>
-      </w:r>
-      <w:proofErr w:type="spellStart"/>
-      <w:r>
-        <w:rPr>
-          <w:sz w:val="28"/>
-          <w:szCs w:val="28"/>
-        </w:rPr>
-        <w:t>чекай</w:t>
-      </w:r>
-      <w:proofErr w:type="spellEnd"/>
-      <w:r>
-        <w:rPr>
-          <w:sz w:val="28"/>
-          <w:szCs w:val="28"/>
-        </w:rPr>
-        <w:t xml:space="preserve"> </w:t>
-      </w:r>
-      <w:proofErr w:type="spellStart"/>
-      <w:r>
-        <w:rPr>
-          <w:sz w:val="28"/>
-          <w:szCs w:val="28"/>
-        </w:rPr>
-        <w:t>вайб</w:t>
-      </w:r>
-      <w:proofErr w:type="spellEnd"/>
-      <w:r>
-        <w:rPr>
-          <w:sz w:val="28"/>
-          <w:szCs w:val="28"/>
-        </w:rPr>
-        <w:t>»);</w:t>
+        <w:t>Всегда выражает поддержку, но формулирует её максимально неуместно и по-молодёжному («это полный кринж, но ты справишься, чекай вайб»);</w:t>
       </w:r>
     </w:p>
     <w:p>
@@ -4833,9 +4305,19 @@
           <w:sz w:val="28"/>
           <w:szCs w:val="28"/>
         </w:rPr>
-        <w:t xml:space="preserve">Пользователь: «Мне грустно, не </w:t>
-      </w:r>
-      <w:proofErr w:type="gramStart"/>
+        <w:t>Пользователь: «Мне грустно, не знаю что делать.»</w:t>
+      </w:r>
+    </w:p>
+    <w:p>
+      <w:pPr>
+        <w:spacing w:line="360" w:lineRule="auto"/>
+        <w:ind w:firstLine="720"/>
+        <w:jc w:val="both"/>
+        <w:rPr>
+          <w:sz w:val="28"/>
+          <w:szCs w:val="28"/>
+        </w:rPr>
+      </w:pPr>
       <w:r>
         <w:rPr>
           <w:i/>
@@ -4843,108 +4325,7 @@
           <w:sz w:val="28"/>
           <w:szCs w:val="28"/>
         </w:rPr>
-        <w:t>знаю</w:t>
-      </w:r>
-      <w:proofErr w:type="gramEnd"/>
-      <w:r>
-        <w:rPr>
-          <w:i/>
-          <w:iCs/>
-          <w:sz w:val="28"/>
-          <w:szCs w:val="28"/>
-        </w:rPr>
-        <w:t xml:space="preserve"> что делать.»</w:t>
-      </w:r>
-    </w:p>
-    <w:p>
-      <w:pPr>
-        <w:spacing w:line="360" w:lineRule="auto"/>
-        <w:ind w:firstLine="720"/>
-        <w:jc w:val="both"/>
-        <w:rPr>
-          <w:sz w:val="28"/>
-          <w:szCs w:val="28"/>
-        </w:rPr>
-      </w:pPr>
-      <w:proofErr w:type="spellStart"/>
-      <w:r>
-        <w:rPr>
-          <w:i/>
-          <w:iCs/>
-          <w:sz w:val="28"/>
-          <w:szCs w:val="28"/>
-        </w:rPr>
-        <w:t>Настюшка</w:t>
-      </w:r>
-      <w:proofErr w:type="spellEnd"/>
-      <w:r>
-        <w:rPr>
-          <w:i/>
-          <w:iCs/>
-          <w:sz w:val="28"/>
-          <w:szCs w:val="28"/>
-        </w:rPr>
-        <w:t xml:space="preserve">: «Ой, это такой </w:t>
-      </w:r>
-      <w:proofErr w:type="spellStart"/>
-      <w:r>
-        <w:rPr>
-          <w:i/>
-          <w:iCs/>
-          <w:sz w:val="28"/>
-          <w:szCs w:val="28"/>
-        </w:rPr>
-        <w:t>кринж-вайб</w:t>
-      </w:r>
-      <w:proofErr w:type="spellEnd"/>
-      <w:r>
-        <w:rPr>
-          <w:i/>
-          <w:iCs/>
-          <w:sz w:val="28"/>
-          <w:szCs w:val="28"/>
-        </w:rPr>
-        <w:t xml:space="preserve">, реально. Но слушай, го чилить? Вообще не понимаю это слово "грустно", это что-то из </w:t>
-      </w:r>
-      <w:proofErr w:type="spellStart"/>
-      <w:r>
-        <w:rPr>
-          <w:i/>
-          <w:iCs/>
-          <w:sz w:val="28"/>
-          <w:szCs w:val="28"/>
-        </w:rPr>
-        <w:t>тиктока</w:t>
-      </w:r>
-      <w:proofErr w:type="spellEnd"/>
-      <w:r>
-        <w:rPr>
-          <w:i/>
-          <w:iCs/>
-          <w:sz w:val="28"/>
-          <w:szCs w:val="28"/>
-        </w:rPr>
-        <w:t xml:space="preserve">? В любом случае ты топ, не </w:t>
-      </w:r>
-      <w:proofErr w:type="spellStart"/>
-      <w:r>
-        <w:rPr>
-          <w:i/>
-          <w:iCs/>
-          <w:sz w:val="28"/>
-          <w:szCs w:val="28"/>
-        </w:rPr>
-        <w:t>токсикуй</w:t>
-      </w:r>
-      <w:proofErr w:type="spellEnd"/>
-      <w:r>
-        <w:rPr>
-          <w:i/>
-          <w:iCs/>
-          <w:sz w:val="28"/>
-          <w:szCs w:val="28"/>
-        </w:rPr>
-        <w:t xml:space="preserve"> на себя!»</w:t>
+        <w:t>Настюшка: «Ой, это такой кринж-вайб, реально. Но слушай, го чилить? Вообще не понимаю это слово "грустно", это что-то из тиктока? В любом случае ты топ, не токсикуй на себя!»</w:t>
       </w:r>
     </w:p>
     <w:p>
@@ -4957,16 +4338,14 @@
         </w:rPr>
       </w:pPr>
       <w:bookmarkStart w:id="16" w:name="_Toc230268175"/>
-      <w:proofErr w:type="gramStart"/>
       <w:r>
         <w:rPr>
           <w:color w:val="auto"/>
           <w:sz w:val="28"/>
           <w:szCs w:val="28"/>
         </w:rPr>
-        <w:t>2.5  Модификация</w:t>
-      </w:r>
-      <w:proofErr w:type="gramEnd"/>
+        <w:t>2.5 Модификация</w:t>
+      </w:r>
       <w:r>
         <w:rPr>
           <w:color w:val="auto"/>
@@ -5015,21 +4394,35 @@
         </w:rPr>
         <w:t>команда /</w:t>
       </w:r>
-      <w:proofErr w:type="spellStart"/>
-      <w:r>
-        <w:rPr>
-          <w:sz w:val="28"/>
-          <w:szCs w:val="28"/>
-        </w:rPr>
-        <w:t>reset</w:t>
-      </w:r>
-      <w:proofErr w:type="spellEnd"/>
-      <w:r>
-        <w:rPr>
-          <w:sz w:val="28"/>
-          <w:szCs w:val="28"/>
-        </w:rPr>
-        <w:t xml:space="preserve"> — сброс контекста диалога и начало нового разговора;</w:t>
+      <w:r>
+        <w:rPr>
+          <w:sz w:val="28"/>
+          <w:szCs w:val="28"/>
+          <w:lang w:val="en-US"/>
+        </w:rPr>
+        <w:t>start</w:t>
+      </w:r>
+      <w:r>
+        <w:rPr>
+          <w:sz w:val="28"/>
+          <w:szCs w:val="28"/>
+        </w:rPr>
+        <w:t xml:space="preserve">— </w:t>
+      </w:r>
+      <w:r>
+        <w:rPr>
+          <w:sz w:val="28"/>
+          <w:szCs w:val="28"/>
+        </w:rPr>
+        <w:t>начало работы</w:t>
+      </w:r>
+      <w:r>
+        <w:rPr>
+          <w:sz w:val="28"/>
+          <w:szCs w:val="28"/>
+          <w:lang w:val="en-US"/>
+        </w:rPr>
+        <w:t>;</w:t>
       </w:r>
     </w:p>
     <w:p>
@@ -5050,39 +4443,7 @@
           <w:sz w:val="28"/>
           <w:szCs w:val="28"/>
         </w:rPr>
-        <w:t>команда /</w:t>
-      </w:r>
-      <w:proofErr w:type="spellStart"/>
-      <w:r>
-        <w:rPr>
-          <w:sz w:val="28"/>
-          <w:szCs w:val="28"/>
-        </w:rPr>
-        <w:t>vibe</w:t>
-      </w:r>
-      <w:proofErr w:type="spellEnd"/>
-      <w:r>
-        <w:rPr>
-          <w:sz w:val="28"/>
-          <w:szCs w:val="28"/>
-        </w:rPr>
-        <w:t xml:space="preserve"> — бот оценивает «</w:t>
-      </w:r>
-      <w:proofErr w:type="spellStart"/>
-      <w:r>
-        <w:rPr>
-          <w:sz w:val="28"/>
-          <w:szCs w:val="28"/>
-        </w:rPr>
-        <w:t>вайб</w:t>
-      </w:r>
-      <w:proofErr w:type="spellEnd"/>
-      <w:r>
-        <w:rPr>
-          <w:sz w:val="28"/>
-          <w:szCs w:val="28"/>
-        </w:rPr>
-        <w:t>» пользователя по последним сообщениям;</w:t>
+        <w:t>команда /reset — сброс контекста диалога и начало нового разговора;</w:t>
       </w:r>
     </w:p>
     <w:p>
@@ -5103,23 +4464,7 @@
           <w:sz w:val="28"/>
           <w:szCs w:val="28"/>
         </w:rPr>
-        <w:t xml:space="preserve">настраиваемый уровень «абсурдности» через параметр </w:t>
-      </w:r>
-      <w:proofErr w:type="spellStart"/>
-      <w:r>
-        <w:rPr>
-          <w:sz w:val="28"/>
-          <w:szCs w:val="28"/>
-        </w:rPr>
-        <w:t>temperature</w:t>
-      </w:r>
-      <w:proofErr w:type="spellEnd"/>
-      <w:r>
-        <w:rPr>
-          <w:sz w:val="28"/>
-          <w:szCs w:val="28"/>
-        </w:rPr>
-        <w:t xml:space="preserve"> модели.</w:t>
+        <w:t>настраиваемый уровень «абсурдности» через параметр temperature модели.</w:t>
       </w:r>
     </w:p>
     <w:p>
@@ -5252,23 +4597,7 @@
           <w:sz w:val="28"/>
           <w:szCs w:val="28"/>
         </w:rPr>
-        <w:t xml:space="preserve">В рамках базовой части освоены: система контроля версий Git, платформа </w:t>
-      </w:r>
-      <w:proofErr w:type="spellStart"/>
-      <w:r>
-        <w:rPr>
-          <w:sz w:val="28"/>
-          <w:szCs w:val="28"/>
-        </w:rPr>
-        <w:t>GitHub</w:t>
-      </w:r>
-      <w:proofErr w:type="spellEnd"/>
-      <w:r>
-        <w:rPr>
-          <w:sz w:val="28"/>
-          <w:szCs w:val="28"/>
-        </w:rPr>
-        <w:t>, язык разметки Markdown, генератор статических сайтов Hugo, основы HTML5 и CSS3. Создан и опубликован сайт http://web-verse.ru с полным комплектом требуемых страниц.</w:t>
+        <w:t>В рамках базовой части освоены: система контроля версий Git, платформа GitHub, язык разметки Markdown, генератор статических сайтов Hugo, основы HTML5 и CSS3. Создан и опубликован сайт http://web-verse.ru с полным комплектом требуемых страниц.</w:t>
       </w:r>
     </w:p>
     <w:p>
@@ -5295,39 +4624,7 @@
           <w:sz w:val="28"/>
           <w:szCs w:val="28"/>
         </w:rPr>
-        <w:t>В рамках вариативной части разработан Telegram-бот «</w:t>
-      </w:r>
-      <w:proofErr w:type="spellStart"/>
-      <w:r>
-        <w:rPr>
-          <w:sz w:val="28"/>
-          <w:szCs w:val="28"/>
-        </w:rPr>
-        <w:t>Настюшка</w:t>
-      </w:r>
-      <w:proofErr w:type="spellEnd"/>
-      <w:r>
-        <w:rPr>
-          <w:sz w:val="28"/>
-          <w:szCs w:val="28"/>
-        </w:rPr>
-        <w:t xml:space="preserve">» на базе локальной языковой модели Ollama. В процессе работы изучены принципы функционирования LLM, техники </w:t>
-      </w:r>
-      <w:proofErr w:type="spellStart"/>
-      <w:r>
-        <w:rPr>
-          <w:sz w:val="28"/>
-          <w:szCs w:val="28"/>
-        </w:rPr>
-        <w:t>промпт</w:t>
-      </w:r>
-      <w:proofErr w:type="spellEnd"/>
-      <w:r>
-        <w:rPr>
-          <w:sz w:val="28"/>
-          <w:szCs w:val="28"/>
-        </w:rPr>
-        <w:t>-инжиниринга, разработка Telegram-ботов на Python. Бот успешно реализует заданный характер персонажа и полностью работоспособен.</w:t>
+        <w:t>В рамках вариативной части разработан Telegram-бот «Настюшка» на базе локальной языковой модели Ollama. В процессе работы изучены принципы функционирования LLM, техники промпт-инжиниринга, разработка Telegram-ботов на Python. Бот успешно реализует заданный характер персонажа и полностью работоспособен.</w:t>
       </w:r>
     </w:p>
     <w:p>
@@ -5441,23 +4738,7 @@
           <w:sz w:val="28"/>
           <w:szCs w:val="28"/>
         </w:rPr>
-        <w:t xml:space="preserve">3.  Основы HTML — MDN Web </w:t>
-      </w:r>
-      <w:proofErr w:type="spellStart"/>
-      <w:r>
-        <w:rPr>
-          <w:sz w:val="28"/>
-          <w:szCs w:val="28"/>
-        </w:rPr>
-        <w:t>Docs</w:t>
-      </w:r>
-      <w:proofErr w:type="spellEnd"/>
-      <w:r>
-        <w:rPr>
-          <w:sz w:val="28"/>
-          <w:szCs w:val="28"/>
-        </w:rPr>
-        <w:t xml:space="preserve"> [Электронный ресурс]. — URL: https://developer.mozilla.org/ru/docs/Learn_web_development/Getting_started/Your_first_website/Creating_the_content (дата обращения: 24.05.2025).</w:t>
+        <w:t>3.  Основы HTML — MDN Web Docs [Электронный ресурс]. — URL: https://developer.mozilla.org/ru/docs/Learn_web_development/Getting_started/Your_first_website/Creating_the_content (дата обращения: 24.05.2025).</w:t>
       </w:r>
     </w:p>
     <w:p>
@@ -5475,23 +4756,7 @@
           <w:sz w:val="28"/>
           <w:szCs w:val="28"/>
         </w:rPr>
-        <w:t xml:space="preserve">4.  Основы CSS — MDN Web </w:t>
-      </w:r>
-      <w:proofErr w:type="spellStart"/>
-      <w:r>
-        <w:rPr>
-          <w:sz w:val="28"/>
-          <w:szCs w:val="28"/>
-        </w:rPr>
-        <w:t>Docs</w:t>
-      </w:r>
-      <w:proofErr w:type="spellEnd"/>
-      <w:r>
-        <w:rPr>
-          <w:sz w:val="28"/>
-          <w:szCs w:val="28"/>
-        </w:rPr>
-        <w:t xml:space="preserve"> [Электронный ресурс]. — URL: https://developer.mozilla.org/ru/docs/Web/CSS (дата обращения: 24.05.2025).</w:t>
+        <w:t>4.  Основы CSS — MDN Web Docs [Электронный ресурс]. — URL: https://developer.mozilla.org/ru/docs/Web/CSS (дата обращения: 24.05.2025).</w:t>
       </w:r>
     </w:p>
     <w:p>
@@ -5527,23 +4792,7 @@
           <w:sz w:val="28"/>
           <w:szCs w:val="28"/>
         </w:rPr>
-        <w:t xml:space="preserve">6.  </w:t>
-      </w:r>
-      <w:proofErr w:type="spellStart"/>
-      <w:r>
-        <w:rPr>
-          <w:sz w:val="28"/>
-          <w:szCs w:val="28"/>
-        </w:rPr>
-        <w:t>python-telegram-bot</w:t>
-      </w:r>
-      <w:proofErr w:type="spellEnd"/>
-      <w:r>
-        <w:rPr>
-          <w:sz w:val="28"/>
-          <w:szCs w:val="28"/>
-        </w:rPr>
-        <w:t xml:space="preserve"> — документация [Электронный ресурс]. — URL: https://python-telegram-bot.org/ (дата обращения: 24.05.2025).</w:t>
+        <w:t>6.  python-telegram-bot — документация [Электронный ресурс]. — URL: https://python-telegram-bot.org/ (дата обращения: 24.05.2025).</w:t>
       </w:r>
     </w:p>
     <w:p>
@@ -5561,23 +4810,7 @@
           <w:sz w:val="28"/>
           <w:szCs w:val="28"/>
         </w:rPr>
-        <w:t xml:space="preserve">7.  Telegram </w:t>
-      </w:r>
-      <w:proofErr w:type="spellStart"/>
-      <w:r>
-        <w:rPr>
-          <w:sz w:val="28"/>
-          <w:szCs w:val="28"/>
-        </w:rPr>
-        <w:t>Bot</w:t>
-      </w:r>
-      <w:proofErr w:type="spellEnd"/>
-      <w:r>
-        <w:rPr>
-          <w:sz w:val="28"/>
-          <w:szCs w:val="28"/>
-        </w:rPr>
-        <w:t xml:space="preserve"> API — официальная документация [Электронный ресурс]. — URL: https://core.telegram.org/bots/api (дата обращения: 24.05.2025).</w:t>
+        <w:t>7.  Telegram Bot API — официальная документация [Электронный ресурс]. — URL: https://core.telegram.org/bots/api (дата обращения: 24.05.2025).</w:t>
       </w:r>
     </w:p>
     <w:p>
@@ -5595,23 +4828,7 @@
           <w:sz w:val="28"/>
           <w:szCs w:val="28"/>
         </w:rPr>
-        <w:t xml:space="preserve">8.  Уроки по Markdown — </w:t>
-      </w:r>
-      <w:proofErr w:type="spellStart"/>
-      <w:r>
-        <w:rPr>
-          <w:sz w:val="28"/>
-          <w:szCs w:val="28"/>
-        </w:rPr>
-        <w:t>Hexlet</w:t>
-      </w:r>
-      <w:proofErr w:type="spellEnd"/>
-      <w:r>
-        <w:rPr>
-          <w:sz w:val="28"/>
-          <w:szCs w:val="28"/>
-        </w:rPr>
-        <w:t xml:space="preserve"> [Электронный ресурс]. — URL: https://ru.hexlet.io/lesson_filters/markdown (дата обращения: 24.05.2025).</w:t>
+        <w:t>8.  Уроки по Markdown — Hexlet [Электронный ресурс]. — URL: https://ru.hexlet.io/lesson_filters/markdown (дата обращения: 24.05.2025).</w:t>
       </w:r>
     </w:p>
     <w:p>
@@ -5636,71 +4853,7 @@
           <w:sz w:val="28"/>
           <w:szCs w:val="28"/>
         </w:rPr>
-        <w:t xml:space="preserve">.  </w:t>
-      </w:r>
-      <w:proofErr w:type="spellStart"/>
-      <w:r>
-        <w:rPr>
-          <w:sz w:val="28"/>
-          <w:szCs w:val="28"/>
-        </w:rPr>
-        <w:t>codecrafters-io</w:t>
-      </w:r>
-      <w:proofErr w:type="spellEnd"/>
-      <w:r>
-        <w:rPr>
-          <w:sz w:val="28"/>
-          <w:szCs w:val="28"/>
-        </w:rPr>
-        <w:t>/</w:t>
-      </w:r>
-      <w:proofErr w:type="spellStart"/>
-      <w:r>
-        <w:rPr>
-          <w:sz w:val="28"/>
-          <w:szCs w:val="28"/>
-        </w:rPr>
-        <w:t>build</w:t>
-      </w:r>
-      <w:proofErr w:type="spellEnd"/>
-      <w:r>
-        <w:rPr>
-          <w:sz w:val="28"/>
-          <w:szCs w:val="28"/>
-        </w:rPr>
-        <w:t>-</w:t>
-      </w:r>
-      <w:proofErr w:type="spellStart"/>
-      <w:r>
-        <w:rPr>
-          <w:sz w:val="28"/>
-          <w:szCs w:val="28"/>
-        </w:rPr>
-        <w:t>your</w:t>
-      </w:r>
-      <w:proofErr w:type="spellEnd"/>
-      <w:r>
-        <w:rPr>
-          <w:sz w:val="28"/>
-          <w:szCs w:val="28"/>
-        </w:rPr>
-        <w:t>-</w:t>
-      </w:r>
-      <w:proofErr w:type="spellStart"/>
-      <w:r>
-        <w:rPr>
-          <w:sz w:val="28"/>
-          <w:szCs w:val="28"/>
-        </w:rPr>
-        <w:t>own</w:t>
-      </w:r>
-      <w:proofErr w:type="spellEnd"/>
-      <w:r>
-        <w:rPr>
-          <w:sz w:val="28"/>
-          <w:szCs w:val="28"/>
-        </w:rPr>
-        <w:t>-x [Электронный ресурс]. — URL: https://github.com/codecrafters-io/build-your-own-x (дата обращения: 24.05.2025).</w:t>
+        <w:t>.  codecrafters-io/build-your-own-x [Электронный ресурс]. — URL: https://github.com/codecrafters-io/build-your-own-x (дата обращения: 24.05.2025).</w:t>
       </w:r>
     </w:p>
     <w:p>
@@ -5732,39 +4885,7 @@
           <w:sz w:val="28"/>
           <w:szCs w:val="28"/>
         </w:rPr>
-        <w:t xml:space="preserve">.  </w:t>
-      </w:r>
-      <w:proofErr w:type="spellStart"/>
-      <w:r>
-        <w:rPr>
-          <w:sz w:val="28"/>
-          <w:szCs w:val="28"/>
-        </w:rPr>
-        <w:t>DevTools</w:t>
-      </w:r>
-      <w:proofErr w:type="spellEnd"/>
-      <w:r>
-        <w:rPr>
-          <w:sz w:val="28"/>
-          <w:szCs w:val="28"/>
-        </w:rPr>
-        <w:t xml:space="preserve"> для «чайников» — </w:t>
-      </w:r>
-      <w:proofErr w:type="spellStart"/>
-      <w:r>
-        <w:rPr>
-          <w:sz w:val="28"/>
-          <w:szCs w:val="28"/>
-        </w:rPr>
-        <w:t>Habr</w:t>
-      </w:r>
-      <w:proofErr w:type="spellEnd"/>
-      <w:r>
-        <w:rPr>
-          <w:sz w:val="28"/>
-          <w:szCs w:val="28"/>
-        </w:rPr>
-        <w:t xml:space="preserve"> [Электронный ресурс]. — URL: https://habr.com/ru/articles/548898/ (дата обращения: 24.05.2025).</w:t>
+        <w:t>.  DevTools для «чайников» — Habr [Электронный ресурс]. — URL: https://habr.com/ru/articles/548898/ (дата обращения: 24.05.2025).</w:t>
       </w:r>
     </w:p>
     <w:p>
@@ -5796,23 +4917,7 @@
           <w:sz w:val="28"/>
           <w:szCs w:val="28"/>
         </w:rPr>
-        <w:t xml:space="preserve">.  ГОСТ 7.32-2017 Отчёт о научно-исследовательской работе. Структура и правила оформления. — М.: </w:t>
-      </w:r>
-      <w:proofErr w:type="spellStart"/>
-      <w:r>
-        <w:rPr>
-          <w:sz w:val="28"/>
-          <w:szCs w:val="28"/>
-        </w:rPr>
-        <w:t>Стандартинформ</w:t>
-      </w:r>
-      <w:proofErr w:type="spellEnd"/>
-      <w:r>
-        <w:rPr>
-          <w:sz w:val="28"/>
-          <w:szCs w:val="28"/>
-        </w:rPr>
-        <w:t>, 2017.</w:t>
+        <w:t>.  ГОСТ 7.32-2017 Отчёт о научно-исследовательской работе. Структура и правила оформления. — М.: Стандартинформ, 2017.</w:t>
       </w:r>
     </w:p>
     <w:sectPr>

</xml_diff>